<commit_message>
i need a concretic version
</commit_message>
<xml_diff>
--- a/Practice-10/ПР10_ЯковлевВиктор_бИПТ-251.docx
+++ b/Practice-10/ПР10_ЯковлевВиктор_бИПТ-251.docx
@@ -1794,6 +1794,37 @@
       </w:r>
     </w:p>
     <w:p/>
+    <w:p>
+      <w:r>
+        <w:t xml:space="preserve">Добавим </w:t>
+      </w:r>
+      <w:r>
+        <w:rPr>
+          <w:lang w:val="en-US"/>
+        </w:rPr>
+        <w:t>blur</w:t>
+      </w:r>
+      <w:r>
+        <w:t>-</w:t>
+      </w:r>
+      <w:r>
+        <w:t xml:space="preserve">эффект к титульному изображению. Поместим виджет титульного изображения в </w:t>
+      </w:r>
+      <w:proofErr w:type="spellStart"/>
+      <w:r>
+        <w:rPr>
+          <w:lang w:val="en-US"/>
+        </w:rPr>
+        <w:t>EffectWidget</w:t>
+      </w:r>
+      <w:proofErr w:type="spellEnd"/>
+      <w:r>
+        <w:t xml:space="preserve"> (</w:t>
+      </w:r>
+      <w:r>
+        <w:t>рис. 9)</w:t>
+      </w:r>
+    </w:p>
     <w:p/>
     <w:sectPr>
       <w:footerReference w:type="default" r:id="rId15"/>

</xml_diff>